<commit_message>
Funding statement and corresponding author address per journal instructions
</commit_message>
<xml_diff>
--- a/paper/Title_Page_JGED.docx
+++ b/paper/Title_Page_JGED.docx
@@ -182,6 +182,18 @@
         <w:br/>
       </w:r>
       <w:r>
+        <w:t xml:space="preserve">Faculty of Informatics and Electronics, Escuela Superior Politécnica de Chimborazo (ESPOCH),</w:t>
+      </w:r>
+      <w:r>
+        <w:br/>
+      </w:r>
+      <w:r>
+        <w:t xml:space="preserve">Panamericana Sur km 1.5, Riobamba EC060155, Ecuador</w:t>
+      </w:r>
+      <w:r>
+        <w:br/>
+      </w:r>
+      <w:r>
         <w:rPr>
           <w:b/>
           <w:bCs/>
@@ -338,7 +350,7 @@
         <w:t xml:space="preserve"> </w:t>
       </w:r>
       <w:r>
-        <w:t xml:space="preserve">This research received no specific grant from any funding agency in the public, commercial, or not-for-profit sectors.</w:t>
+        <w:t xml:space="preserve">This research did not receive any specific grant from funding agencies in the public, commercial, or not-for-profit sectors.</w:t>
       </w:r>
     </w:p>
     <w:p>
@@ -359,7 +371,7 @@
         <w:t xml:space="preserve"> </w:t>
       </w:r>
       <w:r>
-        <w:t xml:space="preserve">The authors used generative AI tools (large language models) as an assistant for language editing, support in writing and debugging analysis code, and LaTeX formatting. The research questions, study design, data collection, execution of the analyses, results, and their interpretation are the authors’ own work; all AI-assisted output was reviewed and verified by the authors, who take full responsibility for the content of this article. No figure was produced with image-generation tools.</w:t>
+        <w:t xml:space="preserve">The authors used Claude (Anthropic), a generative AI large language model, as an assistant for language editing, support in writing and debugging analysis code, and LaTeX formatting. The research questions, study design, data collection, execution of the analyses, results, and their interpretation are the authors’ own work; all AI-assisted output was reviewed and verified by the authors, who take full responsibility for the content of this article. No figure was produced with image-generation tools.</w:t>
       </w:r>
     </w:p>
     <w:p>

</xml_diff>